<commit_message>
Clarify price derivation, add chart and source ledgers, model asset depreciation cohorts
</commit_message>
<xml_diff>
--- a/docs/downloads/script.docx
+++ b/docs/downloads/script.docx
@@ -20,7 +20,7 @@
     </w:p>
     <w:p>
       <w:r>
-        <w:t>本讲稿与55页PPT逐页对应，前49页为主讲，后6页为查阅附录。第1—26页为猪周期行业篇，约29分钟；第27—49页为牧原案例篇，约29分钟。行业篇以独立结尾收束，企业篇有独立开场，可在第26页结束后直接剪开。全片按每分钟约275汉字并加图表停顿，预计约58分钟。资料冻结日为2026年10月24日，估值折现基准为2026年末。</w:t>
+        <w:t>本讲稿与57页PPT逐页对应，前49页为主讲，后8页为查阅附录。第1—26页为猪周期行业篇，约28—29分钟；第27—49页为牧原案例篇，约28—29分钟。行业篇以独立结尾收束，企业篇有独立开场，可在第26页结束后直接剪开。全片按每分钟约285汉字并加图表停顿，预计约57分钟。资料冻结日为2026年10月24日，估值折现基准为2026年末。</w:t>
       </w:r>
     </w:p>
     <w:p>
@@ -51,11 +51,11 @@
     </w:p>
     <w:p>
       <w:r>
-        <w:t>00至29分钟 猪周期行业篇</w:t>
+        <w:t>00至28分26秒 猪周期行业篇</w:t>
         <w:br/>
-        <w:t>29至58分钟 牧原经营与估值案例</w:t>
+        <w:t>28分26秒至57分钟 牧原经营与估值案例</w:t>
         <w:br/>
-        <w:t>约29:02 第26页结束后为推荐剪辑点</w:t>
+        <w:t>约28:26 第26页结束后为推荐剪辑点</w:t>
       </w:r>
     </w:p>
     <w:p>
@@ -77,17 +77,22 @@
         <w:spacing w:after="120"/>
       </w:pPr>
       <w:r>
-        <w:t>建议时间 00:00 至 00:44</w:t>
-      </w:r>
-    </w:p>
-    <w:p>
-      <w:r>
-        <w:t>大家好，这一部分只讨论猪周期。我们先看一头猪的钱花在哪里，再从必要产能成本和正常资本回报出发，推导长期价格中枢，说明周期高价还需要增加哪些假设。随后再补充母猪数量、生产效率、体重、传导时滞、历史经验和需求弹性，理解不同价格判断为什么会分开。</w:t>
-      </w:r>
-    </w:p>
-    <w:p>
-      <w:r>
-        <w:t>资料冻结在二〇二六年十月二十四日。未来的产能、需求和价格都按条件情景解释。行业篇会在观测清单处完整收尾，观众可以只看这一部分。</w:t>
+        <w:t>建议时间 00:00 至 01:01</w:t>
+      </w:r>
+    </w:p>
+    <w:p>
+      <w:r>
+        <w:t>大家好。上一期我们认识了养猪的生产过程、成本差异和周期机制。这一期继续回答一个问题：知道母猪在减少以后，怎样一步一步得到可以复查的价格判断？</w:t>
+      </w:r>
+    </w:p>
+    <w:p>
+      <w:r>
+        <w:t>我们仍然从一头一百二十公斤的商品猪出发。先把成本算清楚，解释不同成本的经营者为什么会继续生产或退出；再将母猪变化转换成经过时滞的有效公斤供给；最后说明这些供给条件如何分别进入历史映射和需求函数，形成价格结果。每一步得到的结果，都会继续用于下一步。</w:t>
+      </w:r>
+    </w:p>
+    <w:p>
+      <w:r>
+        <w:t>行业篇独立收尾。之后的企业案例再把价格、销量和成本转为利润，先完整计算一组高位PE演算，再比较跨周期现金流。资料冻结在二〇二六年十月二十四日，未来数据均按条件情景解释。</w:t>
       </w:r>
     </w:p>
     <w:p>
@@ -99,6 +104,8 @@
           <w:sz w:val="18"/>
         </w:rPr>
         <w:t>来源 报告摘要、§1</w:t>
+        <w:br/>
+        <w:t>数据与假设依据（不朗读） 2026-10-24为本次冻结日；2027为情景年份，不是已经发生的经营结果。</w:t>
       </w:r>
     </w:p>
     <w:p>
@@ -123,7 +130,7 @@
         <w:spacing w:after="120"/>
       </w:pPr>
       <w:r>
-        <w:t>建议时间 00:44 至 02:04</w:t>
+        <w:t>建议时间 01:01 至 02:19</w:t>
       </w:r>
     </w:p>
     <w:p>
@@ -150,6 +157,8 @@
           <w:sz w:val="18"/>
         </w:rPr>
         <w:t>来源 报告§3.1；参考[1]—[5]</w:t>
+        <w:br/>
+        <w:t>数据与假设依据（不朗读） 神农2025H1成本结构见报告§3.1、参考[1]—[5]；2.9/6.7/0.3/1.5/0.2/0.8元每公斤为披露账户，元每头=各项×假设120kg。饲料/仔猪占比由总额12.4计算。</w:t>
       </w:r>
     </w:p>
     <w:p>
@@ -165,7 +174,7 @@
         <w:pStyle w:val="Heading1"/>
       </w:pPr>
       <w:r>
-        <w:t>第03页 政策目标 逐利与资本约束</w:t>
+        <w:t>第03页 先看全图 低价怎样变成下一轮高价</w:t>
       </w:r>
     </w:p>
     <w:p>
@@ -174,22 +183,22 @@
         <w:spacing w:after="120"/>
       </w:pPr>
       <w:r>
-        <w:t>建议时间 02:04 至 03:10</w:t>
-      </w:r>
-    </w:p>
-    <w:p>
-      <w:r>
-        <w:t>报告接受三个研究前提：政府对正常保有量的判断具有合理性，养殖主体以赚钱为目的，经营主体可使用的资本有限。这三个前提很有解释力，但还不足以单独确定猪价。</w:t>
-      </w:r>
-    </w:p>
-    <w:p>
-      <w:r>
-        <w:t>为什么？同样的母猪数量，在不同生产效率下可以产生不同出栏量。同样的出栏量，也可能对应不同收入水平和消费偏好。最后，必要保留的产能若成本不同，长期能接受的价格也不同。只知道数量目标，需求函数和成本分布仍然没有确定。</w:t>
-      </w:r>
-    </w:p>
-    <w:p>
-      <w:r>
-        <w:t>即使进一步假设大多数主体能获得合理利润，还要回答这里的多数按场户数、母猪数，还是商品猪公斤量加权。很多小场盈利与多数供给盈利并非同一含义。我们因此把政策目标作为数量参照，再显式补上成本、需求和回报要求。这样既保留原研究假设，也能清楚看到价格结论究竟依靠了什么。</w:t>
+        <w:t>建议时间 02:19 至 03:11</w:t>
+      </w:r>
+    </w:p>
+    <w:p>
+      <w:r>
+        <w:t>先把整期的因果关系放到同一张图里。猪价下降，先影响经营者的利润和现金，而后才可能改变补栏与母猪淘汰。生产决策发生变化后，还要经过繁育和育肥，才能影响未来可出售的商品猪。供应与需求重新匹配，价格和盈利又会改变。盈利改善还可能刺激补栏扩产，经过时滞增供后，价格重新承压，周期由此闭合。</w:t>
+      </w:r>
+    </w:p>
+    <w:p>
+      <w:r>
+        <w:t>这是一条带有时间差的反馈链。每个环节都可能受到修正：现金充足的经营者可以等待，转手的猪场也可能继续生产；母猪减少可能被效率和体重抵消，需求与库存还会改变价格反应。因此，不能把母猪下降直接翻译成固定幅度涨价。</w:t>
+      </w:r>
+    </w:p>
+    <w:p>
+      <w:r>
+        <w:t>接下来先从成本开始，因为不清楚养殖者要付哪些钱，就无法判断低价为什么会改变生产行为。</w:t>
       </w:r>
     </w:p>
     <w:p>
@@ -200,7 +209,9 @@
         <w:rPr>
           <w:sz w:val="18"/>
         </w:rPr>
-        <w:t>来源 报告§1.4、§5.4；参考[22]</w:t>
+        <w:t>来源 结构参考：上一期PPT第15—24页；本报告§3—§7</w:t>
+        <w:br/>
+        <w:t>数据与假设依据（不朗读） 定性反馈关系，无行业概率或数量预测。参考上一期PPT第15—24页，以及本报告§3—§7。</w:t>
       </w:r>
     </w:p>
     <w:p>
@@ -225,7 +236,7 @@
         <w:spacing w:after="120"/>
       </w:pPr>
       <w:r>
-        <w:t>建议时间 03:10 至 04:20</w:t>
+        <w:t>建议时间 03:11 至 04:19</w:t>
       </w:r>
     </w:p>
     <w:p>
@@ -252,6 +263,8 @@
           <w:sz w:val="18"/>
         </w:rPr>
         <w:t>来源 报告§3.1、§3.5；参考[1]—[5]</w:t>
+        <w:br/>
+        <w:t>数据与假设依据（不朗读） 12.4与直接折旧0.2来自神农披露结构；12.2仅为两项相减，不是完整现金成本。</w:t>
       </w:r>
     </w:p>
     <w:p>
@@ -267,7 +280,7 @@
         <w:pStyle w:val="Heading1"/>
       </w:pPr>
       <w:r>
-        <w:t>第05页 官方调查提供成本量级参照</w:t>
+        <w:t>第05页 地区调查说明成本量级 尚不能给全国边际成本</w:t>
       </w:r>
     </w:p>
     <w:p>
@@ -276,7 +289,7 @@
         <w:spacing w:after="120"/>
       </w:pPr>
       <w:r>
-        <w:t>建议时间 04:20 至 05:30</w:t>
+        <w:t>建议时间 04:19 至 05:27</w:t>
       </w:r>
     </w:p>
     <w:p>
@@ -303,6 +316,8 @@
           <w:sz w:val="18"/>
         </w:rPr>
         <w:t>来源 报告§3.2；参考[6]—[10]</w:t>
+        <w:br/>
+        <w:t>数据与假设依据（不朗读） 按图中地区与原期间匹配，调查公斤成本见报告§3.2、参考[6]—[10]；原重量141.68/141.10/142.24/138.97/125.24kg。调查范围不同，未折算为统一全国效率分位。</w:t>
       </w:r>
     </w:p>
     <w:p>
@@ -327,7 +342,7 @@
         <w:spacing w:after="120"/>
       </w:pPr>
       <w:r>
-        <w:t>建议时间 05:30 至 06:38</w:t>
+        <w:t>建议时间 05:27 至 06:33</w:t>
       </w:r>
     </w:p>
     <w:p>
@@ -354,6 +369,8 @@
           <w:sz w:val="18"/>
         </w:rPr>
         <w:t>来源 报告§3.3；参考[10]—[12]</w:t>
+        <w:br/>
+        <w:t>数据与假设依据（不朗读） 山东2026Q2标准化120kg为原材料预算，不是实际出栏；280/230、900等输入及3%为原文预算口径，合计及除120为换算。实际监测125.24kg、12.74元/kg另列。报告§3.3、参考[10]—[12]。</w:t>
       </w:r>
     </w:p>
     <w:p>
@@ -378,7 +395,7 @@
         <w:spacing w:after="120"/>
       </w:pPr>
       <w:r>
-        <w:t>建议时间 06:38 至 07:46</w:t>
+        <w:t>建议时间 06:33 至 07:39</w:t>
       </w:r>
     </w:p>
     <w:p>
@@ -405,6 +422,8 @@
           <w:sz w:val="18"/>
         </w:rPr>
         <w:t>来源 报告§3.4；参考[13]</w:t>
+        <w:br/>
+        <w:t>数据与假设依据（不朗读） A—E为同一成本结构下技术参数组合，11.83/12.40/13.69/15.26/17.58见报告§3.4及引擎cost结果；不是全国实际成本分位。</w:t>
       </w:r>
     </w:p>
     <w:p>
@@ -420,7 +439,7 @@
         <w:pStyle w:val="Heading1"/>
       </w:pPr>
       <w:r>
-        <w:t>第08页 必要产能成本与长期中枢</w:t>
+        <w:t>第08页 必要产能的成本 怎样形成正常猪价中枢</w:t>
       </w:r>
     </w:p>
     <w:p>
@@ -429,22 +448,22 @@
         <w:spacing w:after="120"/>
       </w:pPr>
       <w:r>
-        <w:t>建议时间 07:46 至 08:58</w:t>
-      </w:r>
-    </w:p>
-    <w:p>
-      <w:r>
-        <w:t>成本法问的是：维持满足需求所必需的产能，长期需要怎样的价格。报告把必要产能的完全成本设为十四点九元，假设每头年销量能力对应一千元权益资本，要求百分之十回报。</w:t>
-      </w:r>
-    </w:p>
-    <w:p>
-      <w:r>
-        <w:t>一千元乘百分之十是一百元，再除一百二十公斤，是每公斤零点八三三三元。加到十四点九元上，得到十五点七三三三元。这里完全成本已经包含债务利息，所以额外加的是权益机会回报。若调查经济成本已含同一资金机会成本，需要先剥离，避免重复补偿。</w:t>
-      </w:r>
-    </w:p>
-    <w:p>
-      <w:r>
-        <w:t>真正需要验证的，是十四点九元档位是否仍为满足需求所必需，以及一千元权益能否支撑对应的年销量能力。地区均值只提供量级参考。这个结果还属于长期中枢，短期主体可能继续亏损生产，现货因此可以低于它；短缺时价格也可以远高于它。把十五点七三当某一季度价格下限，会超出这个公式的用途。</w:t>
+        <w:t>建议时间 07:39 至 08:46</w:t>
+      </w:r>
+    </w:p>
+    <w:p>
+      <w:r>
+        <w:t>这里要先回答：行业价格参考谁的成本？不是最低成本经营者，也不是无论多贵都必须保留的最高成本者，而是在正常需求下，仍然需要它提供供给的那一档产能。</w:t>
+      </w:r>
+    </w:p>
+    <w:p>
+      <w:r>
+        <w:t>前面的地区调查提供成本量级，却没有全国各档产能的权重，所以不能据此画出精确的全国供给曲线。本报告把这档必要产能完全成本设为十四点九元。这是参照调查后的判断，不是统计部门公布的全国边际成本。每头年销量能力再假设对应一千元权益资本，要求百分之十回报，折合每公斤零点八三三三元。相加得到十五点七三三三元。</w:t>
+      </w:r>
+    </w:p>
+    <w:p>
+      <w:r>
+        <w:t>这套完全成本口径已含债务利息，额外补偿的是权益机会回报；若原调查已计同一机会成本，则要先剥离。我们得到的是正常再生产中枢。下一步的问题是：既然中枢在这里，为什么现货还能远低于或者远高于它？</w:t>
       </w:r>
     </w:p>
     <w:p>
@@ -456,6 +475,8 @@
           <w:sz w:val="18"/>
         </w:rPr>
         <w:t>来源 报告§5.1—§5.5</w:t>
+        <w:br/>
+        <w:t>数据与假设依据（不朗读） 14.9元/kg为参照地区调查后的必要产能成本判断；1000元/年销量头、10%权益回报、120kg为演示输入；0.8333=1000×10%/120，15.7333=14.9+0.8333。</w:t>
       </w:r>
     </w:p>
     <w:p>
@@ -471,7 +492,7 @@
         <w:pStyle w:val="Heading1"/>
       </w:pPr>
       <w:r>
-        <w:t>第09页 周期高位价格的额外假设</w:t>
+        <w:t>第09页 15 73元是中枢 为什么现货还能大幅偏离</w:t>
       </w:r>
     </w:p>
     <w:p>
@@ -480,22 +501,22 @@
         <w:spacing w:after="120"/>
       </w:pPr>
       <w:r>
-        <w:t>建议时间 08:58 至 10:05</w:t>
-      </w:r>
-    </w:p>
-    <w:p>
-      <w:r>
-        <w:t>成本公式到这里得到的是正常中枢十五点七三元，还没有得到周期最高价。为了演示高位年度价格的含义，我们额外采用报告里的高位年度二十元示例，相当于比正常中枢高约百分之二十七点一二。</w:t>
-      </w:r>
-    </w:p>
-    <w:p>
-      <w:r>
-        <w:t>这个上浮比例属于情景设定，不能说政府保有量或必要边际成本已经证明了它。它是否合理，后面再用历史振幅、有效供给和需求函数比较。行业篇先把这项价格条件交代清楚，再比较它可能受到哪些供需因素影响。</w:t>
-      </w:r>
-    </w:p>
-    <w:p>
-      <w:r>
-        <w:t>还要把时间单位说清楚。这里假设的是一整年按销售公斤量实现二十元，而不是某天、某个月或某季度最高到二十元。若只有一季二十元，其余季度较低，全年均价就要按实际销售权重重新计算。暂时固定全年二十元，是为了让观众看懂同一条假设链，而不是把短期高点悄悄年化。</w:t>
+        <w:t>建议时间 08:46 至 09:46</w:t>
+      </w:r>
+    </w:p>
+    <w:p>
+      <w:r>
+        <w:t>上一页得到十五点七三元，回答的是长期维持必要产能需要怎样的价格。它并没有预测二〇二七年均价，也没有给出本轮高点。</w:t>
+      </w:r>
+    </w:p>
+    <w:p>
+      <w:r>
+        <w:t>短期低于完全成本时，只要还能覆盖付现支出并获得资金，经营者可能继续养；即使有人退出，猪场也可能被别人承接，所以供应不会马上消失。反过来，当供应暂时不够时，价格上涨也不能让一头仔猪立刻长成商品猪，价格就可能高于中枢。</w:t>
+      </w:r>
+    </w:p>
+    <w:p>
+      <w:r>
+        <w:t>这只能解释偏离的原因，还不能解释偏离多少。要把幅度算出来，先要判断低价究竟改变了多少产能，再扣除效率和体重的抵消，经过生产时滞得到有效供给。后面再用历史价格反应或需求函数计算。高价幅度是否有条件支持，等到价格结果出现以后再判断。</w:t>
       </w:r>
     </w:p>
     <w:p>
@@ -507,6 +528,8 @@
           <w:sz w:val="18"/>
         </w:rPr>
         <w:t>来源 报告修订版 主线演算</w:t>
+        <w:br/>
+        <w:t>数据与假设依据（不朗读） 15.73来自第8页条件计算；本页无外生20元价格预测。短期偏离幅度要接着推导。</w:t>
       </w:r>
     </w:p>
     <w:p>
@@ -522,7 +545,7 @@
         <w:pStyle w:val="Heading1"/>
       </w:pPr>
       <w:r>
-        <w:t>第10页 补充行业判断 供给退出怎样发生</w:t>
+        <w:t>第10页 账面亏损 怎样才会变成供给减少</w:t>
       </w:r>
     </w:p>
     <w:p>
@@ -531,7 +554,7 @@
         <w:spacing w:after="120"/>
       </w:pPr>
       <w:r>
-        <w:t>建议时间 10:05 至 10:59</w:t>
+        <w:t>建议时间 09:46 至 10:38</w:t>
       </w:r>
     </w:p>
     <w:p>
@@ -558,6 +581,8 @@
           <w:sz w:val="18"/>
         </w:rPr>
         <w:t>来源 报告§3.5、§13.1</w:t>
+        <w:br/>
+        <w:t>数据与假设依据（不朗读） 低价、现金压力和退出是机制关系；不包含已估计的退出弹性。</w:t>
       </w:r>
     </w:p>
     <w:p>
@@ -582,7 +607,7 @@
         <w:spacing w:after="120"/>
       </w:pPr>
       <w:r>
-        <w:t>建议时间 10:59 至 12:02</w:t>
+        <w:t>建议时间 10:38 至 11:39</w:t>
       </w:r>
     </w:p>
     <w:p>
@@ -609,6 +634,8 @@
           <w:sz w:val="18"/>
         </w:rPr>
         <w:t>来源 报告§4.1</w:t>
+        <w:br/>
+        <w:t>数据与假设依据（不朗读） PSY/MSY、成活和商品化因子为口径定义。年度出栏/年末母猪仅为粗略比率，不是严格MSY观测。</w:t>
       </w:r>
     </w:p>
     <w:p>
@@ -633,7 +660,7 @@
         <w:spacing w:after="120"/>
       </w:pPr>
       <w:r>
-        <w:t>建议时间 12:02 至 13:08</w:t>
+        <w:t>建议时间 11:39 至 12:43</w:t>
       </w:r>
     </w:p>
     <w:p>
@@ -660,6 +687,8 @@
           <w:sz w:val="18"/>
         </w:rPr>
         <w:t>来源 报告§4.2；参考[14]—[21]</w:t>
+        <w:br/>
+        <w:t>数据与假设依据（不朗读） 中国2025 PSY23.4、神农29.5、北美26.88/28.19、法国33.5、丹麦36.9见参考[14]—[21]；场数1345/703为原资料样本范围。32与6%差距收敛是模型假设，23.916为计算。</w:t>
       </w:r>
     </w:p>
     <w:p>
@@ -675,7 +704,7 @@
         <w:pStyle w:val="Heading1"/>
       </w:pPr>
       <w:r>
-        <w:t>第13页 母猪下降与有效公斤供给</w:t>
+        <w:t>第13页 母猪少10  为什么有效供给可能只少2 665</w:t>
       </w:r>
     </w:p>
     <w:p>
@@ -684,7 +713,7 @@
         <w:spacing w:after="120"/>
       </w:pPr>
       <w:r>
-        <w:t>建议时间 13:08 至 14:19</w:t>
+        <w:t>建议时间 12:43 至 13:52</w:t>
       </w:r>
     </w:p>
     <w:p>
@@ -711,6 +740,8 @@
           <w:sz w:val="18"/>
         </w:rPr>
         <w:t>来源 报告§4.4</w:t>
+        <w:br/>
+        <w:t>数据与假设依据（不朗读） 母猪减少10%、效率增加3%、重量增加5%均为算术演示输入；90、92.7、97.335=100×0.90、再×1.03、再×1.05。不是本轮实测供给。</w:t>
       </w:r>
     </w:p>
     <w:p>
@@ -726,7 +757,7 @@
         <w:pStyle w:val="Heading1"/>
       </w:pPr>
       <w:r>
-        <w:t>第14页 生产传导时滞</w:t>
+        <w:t>第14页 母猪何时减少 决定供应何时减少</w:t>
       </w:r>
     </w:p>
     <w:p>
@@ -735,7 +766,7 @@
         <w:spacing w:after="120"/>
       </w:pPr>
       <w:r>
-        <w:t>建议时间 14:19 至 15:28</w:t>
+        <w:t>建议时间 13:52 至 14:58</w:t>
       </w:r>
     </w:p>
     <w:p>
@@ -762,6 +793,8 @@
           <w:sz w:val="18"/>
         </w:rPr>
         <w:t>来源 报告§4.5、§7.6</w:t>
+        <w:br/>
+        <w:t>数据与假设依据（不朗读） 10个月为固定传导近似，图中季度与母猪月份由日历平移得到；8—12个月分布的10/20/40/20/10%权重是另一假设。</w:t>
       </w:r>
     </w:p>
     <w:p>
@@ -786,7 +819,7 @@
         <w:spacing w:after="120"/>
       </w:pPr>
       <w:r>
-        <w:t>建议时间 15:28 至 16:36</w:t>
+        <w:t>建议时间 14:58 至 16:04</w:t>
       </w:r>
     </w:p>
     <w:p>
@@ -813,6 +846,8 @@
           <w:sz w:val="18"/>
         </w:rPr>
         <w:t>来源 报告§2.1；数据china_history.csv</w:t>
+        <w:br/>
+        <w:t>数据与假设依据（不朗读） 141/138/66/55/57/0由冻结china_history.csv及history_analysis.json计数；0表示未取得全国月度同口径MSY观测，不表示效率为零。</w:t>
       </w:r>
     </w:p>
     <w:p>
@@ -837,7 +872,7 @@
         <w:spacing w:after="120"/>
       </w:pPr>
       <w:r>
-        <w:t>建议时间 16:36 至 17:44</w:t>
+        <w:t>建议时间 16:04 至 17:10</w:t>
       </w:r>
     </w:p>
     <w:p>
@@ -864,6 +899,8 @@
           <w:sz w:val="18"/>
         </w:rPr>
         <w:t>来源 报告§6.1；参考[23]—[39]</w:t>
+        <w:br/>
+        <w:t>数据与假设依据（不朗读） 母猪去化和价格振幅由冻结历史序列及指定窗口计算，见报告§6.1、cycles.json；旧样本与全国绝对头数不拼接，ASF不进入默认校准。</w:t>
       </w:r>
     </w:p>
     <w:p>
@@ -879,7 +916,7 @@
         <w:pStyle w:val="Heading1"/>
       </w:pPr>
       <w:r>
-        <w:t>第17页 历史振幅系数的敏感性</w:t>
+        <w:t>第17页 历史路线 20 81元年均价怎样计算出来</w:t>
       </w:r>
     </w:p>
     <w:p>
@@ -888,22 +925,22 @@
         <w:spacing w:after="120"/>
       </w:pPr>
       <w:r>
-        <w:t>建议时间 17:44 至 18:51</w:t>
-      </w:r>
-    </w:p>
-    <w:p>
-      <w:r>
-        <w:t>历史振幅系数的构造，是用价格谷到峰的对数涨幅，除以历史有效供给收缩的负对数。默认假设历史MSY每年提高百分之二，两段MARA校准系数的中位数约七点五九。</w:t>
-      </w:r>
-    </w:p>
-    <w:p>
-      <w:r>
-        <w:t>一个看起来反直觉的地方是：如果提高历史效率增长假设，算出的振幅系数反而更大。原因是同样的母猪减少，被效率改善抵消后，历史有效供给收缩更小；同样的价格上涨就被归因给更小的数量变化，系数自然上升。</w:t>
-      </w:r>
-    </w:p>
-    <w:p>
-      <w:r>
-        <w:t>当有效供给收缩接近零，分母也接近零，系数会非常不稳定。代码因此对有效去化不足百分之二的阶段排除自动校准。这个阈值是数值稳定规则，不能当经济定律。表中高效率假设得到很高价格，主要反映外推函数的放大效应，其用途更接近压力测试，预测能力仍需要额外的样本外检验。</w:t>
+        <w:t>建议时间 17:10 至 18:23</w:t>
+      </w:r>
+    </w:p>
+    <w:p>
+      <w:r>
+        <w:t>现在把前面得到的有效供给，接到价格。历史路线先选两段现代可比去化阶段，分别用价格窗口振幅除以有效供给收缩，得到历史反应系数，再取中位数。历史效率每年提高百分之二是校准假设，得到系数七点五九三二。它刻画历史窗口反应，不是经过样本外验证的稳定因果参数。</w:t>
+      </w:r>
+    </w:p>
+    <w:p>
+      <w:r>
+        <w:t>本轮观测锚是二〇二六年八月活猪价十一点三六元，以及对应母猪三千九百九十万头。对每个月，用滞后母猪比乘效率比和体重比得到有效供给比，再把十一点三六乘以这个比例的负七点五九三二次方。比如十二月有效供给比约零点八八五三，得到月价约二十八点六五元。</w:t>
+      </w:r>
+    </w:p>
+    <w:p>
+      <w:r>
+        <w:t>把十二个月的结果逐月算出再取平均，才得到全年二十点八一元，不能把年末价格直接当全年价。这个结果已经是一组条件下的高价情景；下一页用严格端点检验，看看历史映射的证据能支持到什么程度。</w:t>
       </w:r>
     </w:p>
     <w:p>
@@ -915,6 +952,8 @@
           <w:sz w:val="18"/>
         </w:rPr>
         <w:t>来源 报告§6.2—§6.3</w:t>
+        <w:br/>
+        <w:t>数据与假设依据（不朗读） 锚点11.36元/kg为2026-08观测；3990万头为其10个月前母猪锚。历史MSY年增2%为设定，β7.593232为两段现代阶段校准结果；月价=11.36×有效供给比^(-β)。12月比0.885282得28.65485，12个月均价20.808179。全部输入及结果见results_price.json。</w:t>
       </w:r>
     </w:p>
     <w:p>
@@ -930,7 +969,7 @@
         <w:pStyle w:val="Heading1"/>
       </w:pPr>
       <w:r>
-        <w:t>第18页 严格十个月端点与事后峰谷</w:t>
+        <w:t>第18页 历史窗口振幅 能代表固定时点预测吗</w:t>
       </w:r>
     </w:p>
     <w:p>
@@ -939,7 +978,7 @@
         <w:spacing w:after="120"/>
       </w:pPr>
       <w:r>
-        <w:t>建议时间 18:51 至 20:04</w:t>
+        <w:t>建议时间 18:23 至 19:33</w:t>
       </w:r>
     </w:p>
     <w:p>
@@ -966,6 +1005,8 @@
           <w:sz w:val="18"/>
         </w:rPr>
         <w:t>来源 报告§6.4—§6.6</w:t>
+        <w:br/>
+        <w:t>数据与假设依据（不朗读） 105.32/44.67%为事后窗口振幅，5.97/−0.06%为预先指定+10月端点比较；见history_analysis.json及报告§6.4—§6.6。不是未来预测命中率。</w:t>
       </w:r>
     </w:p>
     <w:p>
@@ -990,7 +1031,7 @@
         <w:spacing w:after="120"/>
       </w:pPr>
       <w:r>
-        <w:t>建议时间 20:04 至 21:17</w:t>
+        <w:t>建议时间 19:33 至 20:44</w:t>
       </w:r>
     </w:p>
     <w:p>
@@ -1017,6 +1058,8 @@
           <w:sz w:val="18"/>
         </w:rPr>
         <w:t>来源 报告§7.1；参考[40]</w:t>
+        <w:br/>
+        <w:t>数据与假设依据（不朗读） ε=0.374取USDA年度家庭需求先验；λ=0.75为绝对价差传导假设，进口份额2%及需求年降1%为情景输入。方程见报告§7.1。</w:t>
       </w:r>
     </w:p>
     <w:p>
@@ -1041,7 +1084,7 @@
         <w:spacing w:after="120"/>
       </w:pPr>
       <w:r>
-        <w:t>建议时间 21:17 至 22:32</w:t>
+        <w:t>建议时间 20:44 至 21:56</w:t>
       </w:r>
     </w:p>
     <w:p>
@@ -1068,6 +1111,8 @@
           <w:sz w:val="18"/>
         </w:rPr>
         <w:t>来源 报告§7.2</w:t>
+        <w:br/>
+        <w:t>数据与假设依据（不朗读） 需求路线参照的12个月价格及Q1—Q4/年度均价由引擎与独立公式计算，见results_price.json；不是月度已实现价格。</w:t>
       </w:r>
     </w:p>
     <w:p>
@@ -1092,7 +1137,7 @@
         <w:spacing w:after="120"/>
       </w:pPr>
       <w:r>
-        <w:t>建议时间 22:32 至 23:39</w:t>
+        <w:t>建议时间 21:56 至 23:01</w:t>
       </w:r>
     </w:p>
     <w:p>
@@ -1119,6 +1164,8 @@
           <w:sz w:val="18"/>
         </w:rPr>
         <w:t>来源 报告§7.3、附录A</w:t>
+        <w:br/>
+        <w:t>数据与假设依据（不朗读） Q4去化0%、延续4.708995%、翻倍9.417989%为比较输入，均价13.53/14.36/15.32为计算；4.708995%源自3780→3602的Q3变化，但延续到Q4是额外假设。</w:t>
       </w:r>
     </w:p>
     <w:p>
@@ -1134,7 +1181,7 @@
         <w:pStyle w:val="Heading1"/>
       </w:pPr>
       <w:r>
-        <w:t>第22页 效率和体重的抵消作用</w:t>
+        <w:t>第22页 效率与体重 会把同一去化幅度改写多少</w:t>
       </w:r>
     </w:p>
     <w:p>
@@ -1143,7 +1190,7 @@
         <w:spacing w:after="120"/>
       </w:pPr>
       <w:r>
-        <w:t>建议时间 23:39 至 24:50</w:t>
+        <w:t>建议时间 23:01 至 24:10</w:t>
       </w:r>
     </w:p>
     <w:p>
@@ -1170,6 +1217,8 @@
           <w:sz w:val="18"/>
         </w:rPr>
         <w:t>来源 报告§7.4</w:t>
+        <w:br/>
+        <w:t>数据与假设依据（不朗读） 差距收敛0/6/12%与目标体重120/125/130kg是单因素设定；显示猪价由相应需求函数重算。两图都沿用其余参照输入。</w:t>
       </w:r>
     </w:p>
     <w:p>
@@ -1185,7 +1234,7 @@
         <w:pStyle w:val="Heading1"/>
       </w:pPr>
       <w:r>
-        <w:t>第23页 需求弹性与价格函数</w:t>
+        <w:t>第23页 供应相同 需求反应假设也会改变猪价</w:t>
       </w:r>
     </w:p>
     <w:p>
@@ -1194,7 +1243,7 @@
         <w:spacing w:after="120"/>
       </w:pPr>
       <w:r>
-        <w:t>建议时间 24:50 至 26:00</w:t>
+        <w:t>建议时间 24:10 至 25:18</w:t>
       </w:r>
     </w:p>
     <w:p>
@@ -1221,6 +1270,8 @@
           <w:sz w:val="18"/>
         </w:rPr>
         <w:t>来源 报告§7.5、§7.7</w:t>
+        <w:br/>
+        <w:t>数据与假设依据（不朗读） 0.374为年度家庭需求文献先验；0.20和0.60为敏感性输入。17.59/14.36/13.15元为模型输出，不是统计置信区间。</w:t>
       </w:r>
     </w:p>
     <w:p>
@@ -1245,7 +1296,7 @@
         <w:spacing w:after="120"/>
       </w:pPr>
       <w:r>
-        <w:t>建议时间 26:00 至 27:09</w:t>
+        <w:t>建议时间 25:18 至 26:24</w:t>
       </w:r>
     </w:p>
     <w:p>
@@ -1272,6 +1323,8 @@
           <w:sz w:val="18"/>
         </w:rPr>
         <w:t>来源 报告§7.6、§7.8</w:t>
+        <w:br/>
+        <w:t>数据与假设依据（不朗读） 8/10/12月或分布时滞、观测锚或政策锚均为模型选项；年均14.99/14.36/13.84/14.43/15.97见results_price.json。政策3750万头为公开目标，映射为价格另需成本和需求假设。</w:t>
       </w:r>
     </w:p>
     <w:p>
@@ -1287,7 +1340,7 @@
         <w:pStyle w:val="Heading1"/>
       </w:pPr>
       <w:r>
-        <w:t>第25页 美国经验的适用范围</w:t>
+        <w:t>第25页 价格结果汇总 20元在什么意义下使用</w:t>
       </w:r>
     </w:p>
     <w:p>
@@ -1296,22 +1349,22 @@
         <w:spacing w:after="120"/>
       </w:pPr>
       <w:r>
-        <w:t>建议时间 27:09 至 28:20</w:t>
-      </w:r>
-    </w:p>
-    <w:p>
-      <w:r>
-        <w:t>美国经验可以帮助我们思考成熟市场，但必须保持定义。五千头以上经营单位的存栏份额，从二〇〇二年的百分之五十三提高到二〇二二年的百分之七十五。这是按经营单位规模分组，成员会跨组迁移，不能直接当固定企业的所有权集中度。</w:t>
-      </w:r>
-    </w:p>
-    <w:p>
-      <w:r>
-        <w:t>美国商业屠宰头数过去十年复合增速约百分之一点零六，说明行业总量成熟之后，头部仍可能通过份额变化增长。USDA育肥系统调查还显示，大规模组的经济成本点值更低，但单位是美元每一百磅活重增量，包含购入仔猪及合同双方相关成本，与中国每公斤出栏活重成本比较前要调整。</w:t>
-      </w:r>
-    </w:p>
-    <w:p>
-      <w:r>
-        <w:t>Smithfield内部养猪量下降，也提示我们成长可以来自更有效地组织猪源和减少低回报资本占用。对国内养殖行业而言，自养、加工、技术服务和海外合作的扩张，都需要比较投入、资本占用和回收期，不能只看规模。</w:t>
+        <w:t>建议时间 26:24 至 27:36</w:t>
+      </w:r>
+    </w:p>
+    <w:p>
+      <w:r>
+        <w:t>现在可以回答前面留下的问题：二十元是怎么来的。我们实际算出的三个对象是，成本法正常中枢十五点七三元，历史路线条件年均二十点八一元，需求路线条件年均十四点三六元。它们的经济闭合和时间含义不同，不能平均成一个更可靠的预测。</w:t>
+      </w:r>
+    </w:p>
+    <w:p>
+      <w:r>
+        <w:t>源报告另外使用了全年二十元的高位利润演示。本片保留这一整值，便于下一部分把价格翻译成公司利润。从数量级看，它接近历史路线的二十点八一元；但这只是为演算提供参照，不能反过来证明二十元必然实现。尤其刚才的严格端点检验已经表明，历史映射不稳定，需求路线也给出了明显更低的结果。</w:t>
+      </w:r>
+    </w:p>
+    <w:p>
+      <w:r>
+        <w:t>因此，行业篇交付两项可继续使用的结果：一是十五点七三元中枢的成本和回报条件，二是每条年度价格路径及其供需设定。企业篇先固定全年二十元完成一组高位PE演算，再比较价格回归后的股东现金流。</w:t>
       </w:r>
     </w:p>
     <w:p>
@@ -1323,6 +1376,8 @@
           <w:sz w:val="18"/>
         </w:rPr>
         <w:t>来源 报告§10.6—§10.8；参考[52]—[58]</w:t>
+        <w:br/>
+        <w:t>数据与假设依据（不朗读） 15.733333为成本中枢，20.808179和14.355724分别为历史/需求条件年均；20是源报告外生整值演算输入，接近历史路线量级不等于已证明可实现。禁止将三种对象平均。</w:t>
       </w:r>
     </w:p>
     <w:p>
@@ -1347,17 +1402,22 @@
         <w:spacing w:after="120"/>
       </w:pPr>
       <w:r>
-        <w:t>建议时间 28:20 至 29:02</w:t>
-      </w:r>
-    </w:p>
-    <w:p>
-      <w:r>
-        <w:t>行业篇到这里结束。我们从养殖成本出发，说明长期价格需要补偿必要产能的成本及正常资本回报；同时区分了长期中枢和短期高价。母猪减少要经过繁育和育肥的时滞，再叠加生产效率和重量，才能形成有效供给的变化。</w:t>
-      </w:r>
-    </w:p>
-    <w:p>
-      <w:r>
-        <w:t>历史振幅提供经验比较，需求函数提供条件推演，它们都依赖自己的样本和假设。后续观察的重点是母猪和仔猪出生、实际出栏重量、饲料成本、需求与进口。新证据改变输入时，也要相应修正价格判断。感谢收看。</w:t>
+        <w:t>建议时间 27:36 至 28:26</w:t>
+      </w:r>
+    </w:p>
+    <w:p>
+      <w:r>
+        <w:t>行业篇到这里结束。我们从一头猪的成本出发，解释正常价格中枢参考哪一档必要产能，再说明低价怎样通过现金压力改变生产行为。母猪变化还要叠加效率和重量、经过生产时滞，才转成有效供给。</w:t>
+      </w:r>
+    </w:p>
+    <w:p>
+      <w:r>
+        <w:t>历史映射把这组供给条件算成二十点八一元的年度高价情景，需求函数在另一组闭合下得到十四点三六元，成本法则回答十五点七三元的长期中枢。这些结果的差异，正是后续需要判断和更新的条件。</w:t>
+      </w:r>
+    </w:p>
+    <w:p>
+      <w:r>
+        <w:t>持续跟踪母猪与仔猪出生、出栏体重、生产效率、需求和进口。当这些证据改变时，沿着同一条链重算，而不是保留原价格再找解释。感谢收看。</w:t>
       </w:r>
     </w:p>
     <w:p>
@@ -1369,6 +1429,8 @@
           <w:sz w:val="18"/>
         </w:rPr>
         <w:t>来源 本报告行业分析与公开资料汇总</w:t>
+        <w:br/>
+        <w:t>数据与假设依据（不朗读） 复用第8、17、20页计算结果和同一组证据边界，无新增预测。</w:t>
       </w:r>
     </w:p>
     <w:p>
@@ -1393,7 +1455,7 @@
         <w:spacing w:after="120"/>
       </w:pPr>
       <w:r>
-        <w:t>建议时间 29:02 至 29:39</w:t>
+        <w:t>建议时间 28:26 至 29:02</w:t>
       </w:r>
     </w:p>
     <w:p>
@@ -1415,6 +1477,8 @@
           <w:sz w:val="18"/>
         </w:rPr>
         <w:t>来源 本报告行业分析与公开资料汇总</w:t>
+        <w:br/>
+        <w:t>数据与假设依据（不朗读） 企业案例从本页开始；无新增经营数据。</w:t>
       </w:r>
     </w:p>
     <w:p>
@@ -1439,12 +1503,12 @@
         <w:spacing w:after="120"/>
       </w:pPr>
       <w:r>
-        <w:t>建议时间 29:39 至 30:47</w:t>
-      </w:r>
-    </w:p>
-    <w:p>
-      <w:r>
-        <w:t>这条主线只选一组参数。必要产能成本十四点九元，每头年产能权益资本一千元，要求回报百分之十，得到正常价格中枢十五点七三三三元。随后选择源报告已有的全年二十元高价示例，公司实现售价先假设与全国价相同。</w:t>
+        <w:t>建议时间 29:02 至 30:19</w:t>
+      </w:r>
+    </w:p>
+    <w:p>
+      <w:r>
+        <w:t>这条主线只选一组参数。必要产能成本十四点九元，每头年产能权益资本一千元，要求回报百分之十，得到正常价格中枢十五点七三三三元。行业篇已经解释历史条件年均二十点八一元与需求条件年均十四点三六元的差异。这里选择源报告已有的全年二十元高价示例，仅作接近历史情景量级的整值演算，公司实现售价先假设与全国价相同。</w:t>
       </w:r>
     </w:p>
     <w:p>
@@ -1466,6 +1530,8 @@
           <w:sz w:val="18"/>
         </w:rPr>
         <w:t>来源 报告修订版 主线演算</w:t>
+        <w:br/>
+        <w:t>数据与假设依据（不朗读） 14.9、1000、10%、20、0价差、8000万头、120kg、11.8、95%、PE10均为主线输入；15.7333为第8页计算；57.72996144亿股为2026-09股份范围调整，参考[65]。</w:t>
       </w:r>
     </w:p>
     <w:p>
@@ -1490,7 +1556,7 @@
         <w:spacing w:after="120"/>
       </w:pPr>
       <w:r>
-        <w:t>建议时间 30:47 至 31:50</w:t>
+        <w:t>建议时间 30:19 至 31:20</w:t>
       </w:r>
     </w:p>
     <w:p>
@@ -1517,6 +1583,8 @@
           <w:sz w:val="18"/>
         </w:rPr>
         <w:t>来源 报告§1、§2.2</w:t>
+        <w:br/>
+        <w:t>数据与假设依据（不朗读） PE10为研究者设定。价格到利润到定价的顺序，不新增数据。</w:t>
       </w:r>
     </w:p>
     <w:p>
@@ -1541,7 +1609,7 @@
         <w:spacing w:after="120"/>
       </w:pPr>
       <w:r>
-        <w:t>建议时间 31:50 至 32:57</w:t>
+        <w:t>建议时间 31:20 至 32:25</w:t>
       </w:r>
     </w:p>
     <w:p>
@@ -1568,6 +1636,8 @@
           <w:sz w:val="18"/>
         </w:rPr>
         <w:t>来源 报告§2.3、§9.4</w:t>
+        <w:br/>
+        <w:t>数据与假设依据（不朗读） 8000万头、120kg、95%归属为设定；96亿kg=8000×120/10000；1元价差给96亿元折算前利润，95%后91.2亿元。</w:t>
       </w:r>
     </w:p>
     <w:p>
@@ -1592,7 +1662,7 @@
         <w:spacing w:after="120"/>
       </w:pPr>
       <w:r>
-        <w:t>建议时间 32:57 至 34:06</w:t>
+        <w:t>建议时间 32:25 至 33:32</w:t>
       </w:r>
     </w:p>
     <w:p>
@@ -1619,6 +1689,8 @@
           <w:sz w:val="18"/>
         </w:rPr>
         <w:t>来源 报告修订版 主线利润演算；原报告§9.4、§12.8</w:t>
+        <w:br/>
+        <w:t>数据与假设依据（不朗读） 设P20、V8000万头、W120kg、C11.8、α95%；销售公斤96亿，收入1920，成本1132.8，折算前利润787.2，归属等价利润747.84亿元。</w:t>
       </w:r>
     </w:p>
     <w:p>
@@ -1643,7 +1715,7 @@
         <w:spacing w:after="120"/>
       </w:pPr>
       <w:r>
-        <w:t>建议时间 34:06 至 35:11</w:t>
+        <w:t>建议时间 33:32 至 34:34</w:t>
       </w:r>
     </w:p>
     <w:p>
@@ -1670,6 +1742,8 @@
           <w:sz w:val="18"/>
         </w:rPr>
         <w:t>来源 报告修订版 主线演算</w:t>
+        <w:br/>
+        <w:t>数据与假设依据（不朗读） 747.84亿元由第31页计算；PE10为设定，股数57.72996144亿来自[65]；7478.4亿元和129.541053元/股为计算。</w:t>
       </w:r>
     </w:p>
     <w:p>
@@ -1694,7 +1768,7 @@
         <w:spacing w:after="120"/>
       </w:pPr>
       <w:r>
-        <w:t>建议时间 35:11 至 36:21</w:t>
+        <w:t>建议时间 34:34 至 35:42</w:t>
       </w:r>
     </w:p>
     <w:p>
@@ -1721,6 +1795,8 @@
           <w:sz w:val="18"/>
         </w:rPr>
         <w:t>来源 报告§9.1；补充计算销售权重</w:t>
+        <w:br/>
+        <w:t>数据与假设依据（不朗读） 季度公斤权重为设定，年度总量8000万头×120kg、成本11.8、归属95%不变；分别按需求季度价加权得到公司价和利润。</w:t>
       </w:r>
     </w:p>
     <w:p>
@@ -1745,7 +1821,7 @@
         <w:spacing w:after="120"/>
       </w:pPr>
       <w:r>
-        <w:t>建议时间 36:21 至 37:31</w:t>
+        <w:t>建议时间 35:42 至 36:50</w:t>
       </w:r>
     </w:p>
     <w:p>
@@ -1772,6 +1848,8 @@
           <w:sz w:val="18"/>
         </w:rPr>
         <w:t>来源 报告§8；附录E</w:t>
+        <w:br/>
+        <w:t>数据与假设依据（不朗读） 四组输入见引擎PRESETS及results_valuation.json；年均与利润为计算，非概率预测。各组成本、需求与效率可能同时不同。</w:t>
       </w:r>
     </w:p>
     <w:p>
@@ -1796,7 +1874,7 @@
         <w:spacing w:after="120"/>
       </w:pPr>
       <w:r>
-        <w:t>建议时间 37:31 至 38:44</w:t>
+        <w:t>建议时间 36:50 至 38:00</w:t>
       </w:r>
     </w:p>
     <w:p>
@@ -1823,6 +1901,8 @@
           <w:sz w:val="18"/>
         </w:rPr>
         <w:t>来源 报告§9.7</w:t>
+        <w:br/>
+        <w:t>数据与假设依据（不朗读） 各季2000万头、120kg、11.8成本、95%归属为设定，需求季度价来自第20页；利润5.60/35.84/80.97/110.66亿元。</w:t>
       </w:r>
     </w:p>
     <w:p>
@@ -1847,7 +1927,7 @@
         <w:spacing w:after="120"/>
       </w:pPr>
       <w:r>
-        <w:t>建议时间 38:44 至 39:56</w:t>
+        <w:t>建议时间 38:00 至 39:10</w:t>
       </w:r>
     </w:p>
     <w:p>
@@ -1874,6 +1954,8 @@
           <w:sz w:val="18"/>
         </w:rPr>
         <w:t>来源 报告§10.1；参考[44]—[49]</w:t>
+        <w:br/>
+        <w:t>数据与假设依据（不朗读） 2016—2025销量序列为公司历史披露，见muyuan_financial_history.json和company_growth.json；46.52%为2015—2025商品猪销量CAGR计算，不是未来增长率。</w:t>
       </w:r>
     </w:p>
     <w:p>
@@ -1898,7 +1980,7 @@
         <w:spacing w:after="120"/>
       </w:pPr>
       <w:r>
-        <w:t>建议时间 39:56 至 41:07</w:t>
+        <w:t>建议时间 39:10 至 40:19</w:t>
       </w:r>
     </w:p>
     <w:p>
@@ -1925,6 +2007,8 @@
           <w:sz w:val="18"/>
         </w:rPr>
         <w:t>来源 报告§10.2—§10.4；参考[49]—[51]</w:t>
+        <w:br/>
+        <w:t>数据与假设依据（不朗读） PSY30、成活93%、商品化98%、目标8000/9000/10000万头均为情景；71973万头为2025全国出栏基准；2000元/新增年销量头及提前一年投资为设定；所需母猪、份额、资本和5%营运金为计算。</w:t>
       </w:r>
     </w:p>
     <w:p>
@@ -1949,7 +2033,7 @@
         <w:spacing w:after="120"/>
       </w:pPr>
       <w:r>
-        <w:t>建议时间 41:07 至 42:20</w:t>
+        <w:t>建议时间 40:19 至 41:30</w:t>
       </w:r>
     </w:p>
     <w:p>
@@ -1976,6 +2060,8 @@
           <w:sz w:val="18"/>
         </w:rPr>
         <w:t>来源 修订报告§11方法说明、§12.5债务边界</w:t>
+        <w:br/>
+        <w:t>数据与假设依据（不朗读） FCFF/FCFE现金归属、折现率及净债桥为定义。示例没有把FCFE用WACC折现。</w:t>
       </w:r>
     </w:p>
     <w:p>
@@ -1991,7 +2077,7 @@
         <w:pStyle w:val="Heading1"/>
       </w:pPr>
       <w:r>
-        <w:t>第39页 利润到股权现金流的现金桥</w:t>
+        <w:t>第39页 利润到现金 每一笔调整分别是什么</w:t>
       </w:r>
     </w:p>
     <w:p>
@@ -2000,7 +2086,7 @@
         <w:spacing w:after="120"/>
       </w:pPr>
       <w:r>
-        <w:t>建议时间 42:20 至 43:34</w:t>
+        <w:t>建议时间 41:30 至 42:42</w:t>
       </w:r>
     </w:p>
     <w:p>
@@ -2027,6 +2113,8 @@
           <w:sz w:val="18"/>
         </w:rPr>
         <w:t>来源 报告§11.1—§11.2</w:t>
+        <w:br/>
+        <w:t>数据与假设依据（不朗读） 233.0821利润来自需求参照；D&amp;A115.2为96亿kg×1.2元的归属等价假设；65亿元固定更新参考管理层60—70量级；其他更新30为待核对占位。增长0、净借款0为平量假设，营运金释放1.0925由5%收入与期初70计算，合计FCFE254.3746。</w:t>
       </w:r>
     </w:p>
     <w:p>
@@ -2051,7 +2139,7 @@
         <w:spacing w:after="120"/>
       </w:pPr>
       <w:r>
-        <w:t>建议时间 43:34 至 44:44</w:t>
+        <w:t>建议时间 42:42 至 43:50</w:t>
       </w:r>
     </w:p>
     <w:p>
@@ -2066,7 +2154,7 @@
     </w:p>
     <w:p>
       <w:r>
-        <w:t>这些只是年度年末口径，不能当实际流动性预算。还需要月内最高缺口、到期债务、受限现金、经营储备和可用授信。源报告二〇二六年中期现金等价物约一百三十六点二九亿元，广义有息债代理约七百六十四点二八亿元，不能直接拿现金余额覆盖表格就宣布融资安全。若资金不足，必须调整扩张、融资、分红或股份数，随后重新计算每股价值。</w:t>
+        <w:t>这些只是年度年末口径，不能当实际流动性预算。还需要月内最高缺口、到期债务、受限现金、经营储备和可用授信。源报告二〇二六年中期现金等价物约一百三十六点二九亿元，广义有息债代理约七百六十五点九七亿元，不能直接拿现金余额覆盖表格就宣布融资安全。若资金不足，必须调整扩张、融资、分红或股份数，随后重新计算每股价值。</w:t>
       </w:r>
     </w:p>
     <w:p>
@@ -2078,6 +2166,8 @@
           <w:sz w:val="18"/>
         </w:rPr>
         <w:t>来源 报告§11.3、§13.1；参考[61]</w:t>
+        <w:br/>
+        <w:t>数据与假设依据（不朗读） 正常/缓慢/低谷输入及8000/9000万头目标见结果JSON。最低期初现金按年度累计FCFE负缺口计算，不是公司实际所需融资额度。</w:t>
       </w:r>
     </w:p>
     <w:p>
@@ -2093,7 +2183,7 @@
         <w:pStyle w:val="Heading1"/>
       </w:pPr>
       <w:r>
-        <w:t>第41页 折旧 完全成本与现金流</w:t>
+        <w:t>第41页 存量折旧到期 还要叠加新增与更新折旧</w:t>
       </w:r>
     </w:p>
     <w:p>
@@ -2102,22 +2192,22 @@
         <w:spacing w:after="120"/>
       </w:pPr>
       <w:r>
-        <w:t>建议时间 44:44 至 46:01</w:t>
-      </w:r>
-    </w:p>
-    <w:p>
-      <w:r>
-        <w:t>成本表需要把折旧和经营现金说清楚。存量资产折旧到期可能降低账面成本，但新增、更新和生物资产也可能继续产生折旧，因此未来具体降多少需要资产年限与更新明细支持，不能直接编出下降计划。</w:t>
-      </w:r>
-    </w:p>
-    <w:p>
-      <w:r>
-        <w:t>这张独立例子固定售价十六元、九十六亿公斤，先把税费和归属差异设为零。单位折旧从一点二降到零点六，完全成本从十一点八降到十一点二，利润由四百零三点二升到四百六十点八亿元。但折旧加回同时由一百一十五点二降到五十七点六亿元，利润加折旧合计仍是五百一十八点四亿元。</w:t>
-      </w:r>
-    </w:p>
-    <w:p>
-      <w:r>
-        <w:t>如果维护等其他现金投入也不变，股东现金流就不因纯会计折旧减少而增加。真正能提高现金的，是付现成本下降、资本支出减少或周转改善。附录现金流参照把基础成本明确保持十一点八元，不再额外人为调高；若采用折旧下降情景，必须同步重算完全成本与折旧加回。</w:t>
+        <w:t>建议时间 43:50 至 45:19</w:t>
+      </w:r>
+    </w:p>
+    <w:p>
+      <w:r>
+        <w:t>前面的资本开支是实际付款，本页补上另一张账：每年有多少折旧进入利润。公司在二〇二六年六月二十三日交流中说明，未来存量固定资产折旧到期，会降低折旧在完全成本中的占比，并释放利润弹性。年报还披露了不同资产类别的折旧政策。</w:t>
+      </w:r>
+    </w:p>
+    <w:p>
+      <w:r>
+        <w:t>但是，公司没有在这些材料里给出每一批现有资产还剩几年。所以本例把首年一百一十五点二亿元折旧，均匀分到剩余一至十年各档。这是可修改的年龄情景，不是已披露资产台账。固定维护六十五亿元和增长投资按十年、残值百分之五折旧；其他更新三十亿元暂按二点五年、残值百分之三十资本化，并明确这是待勾稽的类别假设。更新从次年投用，增长按原有付款与达产时点衔接。</w:t>
+      </w:r>
+    </w:p>
+    <w:p>
+      <w:r>
+        <w:t>图上旧资产折旧下降，新资产折旧上升。这个十年年龄情景中，前几年新增折旧暂时超过到期额，因此成本会有轻微上升，后期才下降。更早到期的年龄结构会更早降本，不能为了让曲线好看而把它当事实。没有边际折旧所得税影响时，利润提高与折旧加回减少抵销；真正改变现金价值的，是实际投入、周转和终值现金预算。</w:t>
       </w:r>
     </w:p>
     <w:p>
@@ -2128,7 +2218,9 @@
         <w:rPr>
           <w:sz w:val="18"/>
         </w:rPr>
-        <w:t>来源 报告修订版§12 折旧会计演示；本次独立复算</w:t>
+        <w:t>来源 披露：2026-06活动记录第2页；2025年报财务附注14、17；设定：资产年龄与投入类别</w:t>
+        <w:br/>
+        <w:t>数据与假设依据（不朗读） 公司2026-06交流第2页说明存量折旧到期降本；2025年报附注14/17给固定资产及种猪折旧政策。首年115.2、存量剩余1—10年均匀、新固定资产10年5%、其他更新2.5年30%均为本次简化模型口径；65/30亿元全部资本化及次年投用亦为情景，真实类别和资产年龄待核对。图线是这些设定的计算结果，不是披露资产台账。</w:t>
       </w:r>
     </w:p>
     <w:p>
@@ -2153,22 +2245,22 @@
         <w:spacing w:after="120"/>
       </w:pPr>
       <w:r>
-        <w:t>建议时间 46:01 至 47:11</w:t>
-      </w:r>
-    </w:p>
-    <w:p>
-      <w:r>
-        <w:t>接着把需求路线的年度现金流折现。二〇二七年价格沿用需求路线均价，二〇二八年线性修复，二〇二九年达到正常全国价十五点五元。公司基础完全成本在这组参照里保持十一点八元，折旧摊销为一百一十五点二亿元，显性期必要维护合计九十五亿元。</w:t>
-      </w:r>
-    </w:p>
-    <w:p>
-      <w:r>
-        <w:t>重算的十年现金流现值约2056.21亿元，终值首年现金流三百三十七点四四亿元，终值现值约1300.98亿元。股权总价值约3357.19亿元，除以统一股数，得到每股五十八点一五元。终值占比约百分之38.75。</w:t>
-      </w:r>
-    </w:p>
-    <w:p>
-      <w:r>
-        <w:t>这组结果仍需要价格修复、维护预算与融资滚续成立。十一点八元固定是明确的成本参照，不代表已经验证未来每年成本不变。若判断未来实际成本下降，应根据饲料、效率、折旧和新增更新资料建路径，并同步调整现金支出。这里没有把成本下降或上升写成未披露的事实。</w:t>
+        <w:t>建议时间 45:19 至 46:32</w:t>
+      </w:r>
+    </w:p>
+    <w:p>
+      <w:r>
+        <w:t>按新增资产批次模型，十年显性FCFE现值仍约二千零五十六点二一亿元。原因是这里边际折旧税效应设为零，折旧进入利润后又在现金桥加回；仅仅更改资产年龄，没有自动创造现金。</w:t>
+      </w:r>
+    </w:p>
+    <w:p>
+      <w:r>
+        <w:t>终值改用明确的维护更新现金预算九十五亿元，不再强制让现金维护等于旧的恒定折旧一百一十五点二亿元。稳定更新折旧按资本化和残值假设约八十二点七五亿元，归属等价利润约三百六十九点八九亿元。利润加折旧再扣九十五亿元，终值FCFE为三百五十七点六四亿元。所得平量每股价值约五十九点五零元。</w:t>
+      </w:r>
+    </w:p>
+    <w:p>
+      <w:r>
+        <w:t>原恒定折旧、终值维护等于折旧的对照为五十八点一五元。两者约一点三五元差额来自终值维护现金预算的改变，不能说是折旧到期本身免费增加了这么多价值。实际应用还要验证九十五亿元是否足够长期更新同等产能，以及已经费用化的项目有没有再次扣除。</w:t>
       </w:r>
     </w:p>
     <w:p>
@@ -2180,6 +2272,8 @@
           <w:sz w:val="18"/>
         </w:rPr>
         <w:t>来源 报告§12.2.1</w:t>
+        <w:br/>
+        <w:t>数据与假设依据（不朗读） 显性期2027—2036、折现率10%、g0、股数57.72996144亿、现金维护95亿元为本次参照；年表见cohort_results.json，计算价值59.502314元/股。与恒定折旧对照58.153279的差来自终值维护预算，不是非现金折旧本身制造现金。</w:t>
       </w:r>
     </w:p>
     <w:p>
@@ -2204,7 +2298,7 @@
         <w:spacing w:after="120"/>
       </w:pPr>
       <w:r>
-        <w:t>建议时间 47:11 至 48:20</w:t>
+        <w:t>建议时间 46:32 至 47:39</w:t>
       </w:r>
     </w:p>
     <w:p>
@@ -2231,6 +2325,8 @@
           <w:sz w:val="18"/>
         </w:rPr>
         <w:t>来源 报告§12.2.2、§13.3</w:t>
+        <w:br/>
+        <w:t>数据与假设依据（不朗读） 长期猪价14/15/15.5/16/17、股权回报8/10/12%为输入网格；所有曲线值见cohort_results.json matrices，其他条件保持一致。</w:t>
       </w:r>
     </w:p>
     <w:p>
@@ -2255,7 +2351,7 @@
         <w:spacing w:after="120"/>
       </w:pPr>
       <w:r>
-        <w:t>建议时间 48:20 至 49:27</w:t>
+        <w:t>建议时间 47:39 至 48:44</w:t>
       </w:r>
     </w:p>
     <w:p>
@@ -2265,7 +2361,7 @@
     </w:p>
     <w:p>
       <w:r>
-        <w:t>新增权益回报先设百分之十五。零增长每股五十八点一五元，百分之一约五十九点二二元，百分之二约六十点五二元。新增回报率属于独立条件，不能仅因为想提高估值就使用很高回报。</w:t>
+        <w:t>新增权益回报先设百分之十五。零增长每股五十九点五零元，百分之一约五十九点二二元，百分之二约六十点五二元。新增回报率属于独立条件，不能仅因为想提高估值就使用很高回报。</w:t>
       </w:r>
     </w:p>
     <w:p>
@@ -2282,6 +2378,8 @@
           <w:sz w:val="18"/>
         </w:rPr>
         <w:t>来源 报告§12.2.3；physicalTerminalExtension</w:t>
+        <w:br/>
+        <w:t>数据与假设依据（不朗读） g0/1/2%、新增权益ROE15%为设定，扣支持增长再投资后的价值见cohort_results.json terminal。</w:t>
       </w:r>
     </w:p>
     <w:p>
@@ -2306,7 +2404,7 @@
         <w:spacing w:after="120"/>
       </w:pPr>
       <w:r>
-        <w:t>建议时间 49:27 至 50:36</w:t>
+        <w:t>建议时间 48:44 至 49:51</w:t>
       </w:r>
     </w:p>
     <w:p>
@@ -2333,6 +2431,8 @@
           <w:sz w:val="18"/>
         </w:rPr>
         <w:t>来源 报告§12.3—§12.6</w:t>
+        <w:br/>
+        <w:t>数据与假设依据（不朗读） PE、PB、剩余收益和EV方程为恒等式或稳态假设表达；经营范围和资本条件需一致。</w:t>
       </w:r>
     </w:p>
     <w:p>
@@ -2357,17 +2457,17 @@
         <w:spacing w:after="120"/>
       </w:pPr>
       <w:r>
-        <w:t>建议时间 50:36 至 51:47</w:t>
-      </w:r>
-    </w:p>
-    <w:p>
-      <w:r>
-        <w:t>在修订后的统一模型里，八千万头平量价值约五十八点一五元。百分之二增长三次、每新增年销量头一千元当年投资的配置，重算为六十点五零元；相同销量路径改成两千元提前一年投入，约五十九点七三元。</w:t>
-      </w:r>
-    </w:p>
-    <w:p>
-      <w:r>
-        <w:t>二〇三一年达到九千万头，价值约六十一点二三元；达到一亿头，约六十四点二八元。相对平量分别增加约三点零七和六点一三元。所有路径都使用同一单位价格和基础成本，区别在销量及配套资本，增长资本与营运资金仍要逐项扣除。</w:t>
+        <w:t>建议时间 49:51 至 51:00</w:t>
+      </w:r>
+    </w:p>
+    <w:p>
+      <w:r>
+        <w:t>在修订后的统一模型里，八千万头平量价值约五十九点五零元。百分之二增长三次、每新增年销量头一千元当年投资的配置，重算为六十一点九三元；相同销量路径改成两千元提前一年投入，约六十一点一六元。</w:t>
+      </w:r>
+    </w:p>
+    <w:p>
+      <w:r>
+        <w:t>二〇三一年达到九千万头，价值约六十二点七四元；达到一亿头，约六十五点九七元。相对平量分别增加约三点二四和六点一三元。所有路径都使用同一单位价格和基础成本，区别在销量及配套资本，增长资本与营运资金仍要逐项扣除。</w:t>
       </w:r>
     </w:p>
     <w:p>
@@ -2384,6 +2484,8 @@
           <w:sz w:val="18"/>
         </w:rPr>
         <w:t>来源 报告§10.5、§12.7</w:t>
+        <w:br/>
+        <w:t>数据与假设依据（不朗读） 8000平量、2%增长三次、2031年9000/10000万为设定；1000元当年投资为旧资本对照，2000元提前投资为当前参照。新增价值等于所选FCFE减平量FCFE，非零成本扩张。</w:t>
       </w:r>
     </w:p>
     <w:p>
@@ -2408,17 +2510,17 @@
         <w:spacing w:after="120"/>
       </w:pPr>
       <w:r>
-        <w:t>建议时间 51:47 至 53:03</w:t>
-      </w:r>
-    </w:p>
-    <w:p>
-      <w:r>
-        <w:t>现在回到开头已经完成的主线，直接比较相同首年高价。全年二十元、成本十一点八元的利润，乘十倍得到每股一百二十九点五四元。如果只把这组高价放在首年，随后回到十五点五元，并逐年扣必要资本和营运资金，当前修订模型的现金流价值约六十九点八九元。</w:t>
-      </w:r>
-    </w:p>
-    <w:p>
-      <w:r>
-        <w:t>十八元全年价对应的高位十倍PE约九十七点九五元，后续回归的现金流价值约六十五点七三元。十六元则分别约六十六点三五和六十一点五七元。这里没有另外改变公司正常基础成本，差异主要来自价格持续期和现金投入。</w:t>
+        <w:t>建议时间 51:00 至 52:14</w:t>
+      </w:r>
+    </w:p>
+    <w:p>
+      <w:r>
+        <w:t>现在回到开头已经完成的主线，直接比较相同首年高价。全年二十元、成本十一点八元的利润，乘十倍得到每股一百二十九点五四元。如果只把这组高价放在首年，随后回到十五点五元，并逐年扣必要资本和营运资金，当前修订模型的现金流价值约七十一点二四元。</w:t>
+      </w:r>
+    </w:p>
+    <w:p>
+      <w:r>
+        <w:t>十八元全年价对应的高位十倍PE约九十七点九五元，后续回归的现金流价值约六十七点零八元。十六元则分别约六十六点三五和六十二点九二元。这里没有另外改变公司正常基础成本，差异主要来自价格持续期和现金投入。</w:t>
       </w:r>
     </w:p>
     <w:p>
@@ -2435,6 +2537,8 @@
           <w:sz w:val="18"/>
         </w:rPr>
         <w:t>来源 报告§12.8</w:t>
+        <w:br/>
+        <w:t>数据与假设依据（不朗读） 首年16/18/20元和PE10为输入；高位利润×10PE与后续价格回归15.5的FCFE结果见cohort_results.json peak。价格持续期和资本投入不同。</w:t>
       </w:r>
     </w:p>
     <w:p>
@@ -2459,7 +2563,7 @@
         <w:spacing w:after="120"/>
       </w:pPr>
       <w:r>
-        <w:t>建议时间 53:03 至 54:13</w:t>
+        <w:t>建议时间 52:14 至 53:22</w:t>
       </w:r>
     </w:p>
     <w:p>
@@ -2469,7 +2573,7 @@
     </w:p>
     <w:p>
       <w:r>
-        <w:t>补充价格路线中，需求法二〇二七年均价约十四点三六元，历史振幅外推约二十点八一元。各自的锚点、函数和时间尺度不同。将需求价格逐年修复到十五点五元，并按十一点八元基础成本与必要资本投入计算，平量股权现金流价值约五十八点一五元；二〇三一年达到九千万头，则约六十一点二三元。</w:t>
+        <w:t>补充价格路线中，需求法二〇二七年均价约十四点三六元，历史振幅外推约二十点八一元。各自的锚点、函数和时间尺度不同。将需求价格逐年修复到十五点五元，并按十一点八元基础成本与必要资本投入计算，平量股权现金流价值约五十九点五零元；二〇三一年达到九千万头，则约六十二点七四元。</w:t>
       </w:r>
     </w:p>
     <w:p>
@@ -2486,6 +2590,8 @@
           <w:sz w:val="18"/>
         </w:rPr>
         <w:t>来源 报告摘要、§12.2、§12.7</w:t>
+        <w:br/>
+        <w:t>数据与假设依据（不朗读） 复用第8、17、20、32、42、46页，保留各自设定，不新增或平均经济判断。</w:t>
       </w:r>
     </w:p>
     <w:p>
@@ -2510,7 +2616,7 @@
         <w:spacing w:after="120"/>
       </w:pPr>
       <w:r>
-        <w:t>建议时间 54:13 至 58:05</w:t>
+        <w:t>建议时间 53:22 至 57:11</w:t>
       </w:r>
     </w:p>
     <w:p>
@@ -2520,7 +2626,7 @@
     </w:p>
     <w:p>
       <w:r>
-        <w:t>现在打开配套网页，先载入主线高位情景，确认二十元、七百四十七点八四亿元和一百二十九点五四元，再点击修订现金流参照，确认年均价约十四点三六元、首年利润约二百三十三点零八亿元、价值约五十八点一五元。再切换到二〇三一年九千万头，观察提前投资和每股价值变化。之后载入旧销量及投资配置，比较百分之二增长三次、每头一千元当年投资为何得到六十点五零元。</w:t>
+        <w:t>现在打开配套网页，先载入主线高位情景，确认二十元、七百四十七点八四亿元和一百二十九点五四元，再点击修订现金流参照，确认年均价约十四点三六元、首年利润约二百三十三点零八亿元、价值约五十九点五零元。再切换到二〇三一年九千万头，观察提前投资和每股价值变化。之后载入旧销量及投资配置，比较百分之二增长三次、每头一千元当年投资为何得到六十一点九三元。</w:t>
       </w:r>
     </w:p>
     <w:p>
@@ -2537,6 +2643,8 @@
           <w:sz w:val="18"/>
         </w:rPr>
         <w:t>来源 报告§13—§15、附录A；配套网页</w:t>
+        <w:br/>
+        <w:t>数据与假设依据（不朗读） 747.84/129.54为主线演算，233.08/59.50为新批次FCFE参照，62.74为9000万情景；成本增加0.1导致首年利润减少9.12亿元=96×0.1×95%。</w:t>
       </w:r>
     </w:p>
     <w:p>
@@ -2571,7 +2679,7 @@
     </w:p>
     <w:p>
       <w:r>
-        <w:t>本页作为答疑查阅。重点解释生产阶段、母猪分母和价格环节，避免把活猪、零售、出栏活重和活重增量混用。主讲可略过。</w:t>
+        <w:t>本页作为答疑查阅。重点解释生产阶段、母猪分母和价格环节，避免把活猪、零售、出栏活重和活重增量混用。主讲可略过。 资产批次折旧另列存量和新增部分，均使用归属等价金额。</w:t>
       </w:r>
     </w:p>
     <w:p>
@@ -2583,6 +2691,8 @@
           <w:sz w:val="18"/>
         </w:rPr>
         <w:t>来源 报告§2、附录C</w:t>
+        <w:br/>
+        <w:t>数据与假设依据（不朗读） 单位和符号定义，不属于额外预测。</w:t>
       </w:r>
     </w:p>
     <w:p>
@@ -2616,6 +2726,8 @@
           <w:sz w:val="18"/>
         </w:rPr>
         <w:t>来源 报告附录C、附录E</w:t>
+        <w:br/>
+        <w:t>数据与假设依据（不朗读） 3750政策目标及3602万头为公开资料，其他显示经营、效率、折现、投资和折旧输入均为可修改情景；全部131字段见当前PARAMS。</w:t>
       </w:r>
     </w:p>
     <w:p>
@@ -2637,7 +2749,7 @@
     </w:p>
     <w:p>
       <w:r>
-        <w:t>修订版逐年现金流参照保持基础完全成本十一点八元，不附加其他自动成本调整。折旧单独列示；未来若改折旧路径，必须同时修改完全成本和折旧加回，并按实际新增及维护资产证据计算。二〇二七年末为第一期，二〇三六年末另计终值。</w:t>
+        <w:t>本表采用存量到期及新增、更新资产的批次折旧情景。基础经营输入仍是首年完全成本十一点八元及其所含参考折旧，表中完全成本再按实际批次折旧重算，不能把十一点八永久不变与折旧下降同时用于同一利润账户。年龄分布不是公司披露台账。完整存量、新增和合计折旧见网页年度表及公开结果JSON。</w:t>
       </w:r>
     </w:p>
     <w:p>
@@ -2649,6 +2761,8 @@
           <w:sz w:val="18"/>
         </w:rPr>
         <w:t>来源 报告§12.2.1</w:t>
+        <w:br/>
+        <w:t>数据与假设依据（不朗读） 所有年份的价格、等价完全成本、利润、存量及新增折旧、维护、营运金和FCFE来自cohort_results.json base.annual；输入与限制见第41、42页。</w:t>
       </w:r>
     </w:p>
     <w:p>
@@ -2682,6 +2796,8 @@
           <w:sz w:val="18"/>
         </w:rPr>
         <w:t>来源 报告附录A—B</w:t>
+        <w:br/>
+        <w:t>数据与假设依据（不朗读） 字段名与复算文件名来自当前源代码，不新增经济数据。</w:t>
       </w:r>
     </w:p>
     <w:p>
@@ -2715,6 +2831,8 @@
           <w:sz w:val="18"/>
         </w:rPr>
         <w:t>来源 修订audit.md、测试日志</w:t>
+        <w:br/>
+        <w:t>数据与假设依据（不朗读） 版本、字段数量、测试数及估值由当前代码与测试日志直接计数；不是外部研究结论。</w:t>
       </w:r>
     </w:p>
     <w:p>
@@ -2748,6 +2866,114 @@
           <w:sz w:val="18"/>
         </w:rPr>
         <w:t>来源 报告参考文献[1]—[65]</w:t>
+        <w:br/>
+        <w:t>数据与假设依据（不朗读） 65为报告直接引用编号数量；完整冻结来源登记sourceCount158另有辅助资料，不混作65项。</w:t>
+      </w:r>
+    </w:p>
+    <w:p>
+      <w:pPr>
+        <w:pStyle w:val="Heading1"/>
+      </w:pPr>
+      <w:r>
+        <w:t>第56页 附录G 美国经验的适用范围</w:t>
+      </w:r>
+    </w:p>
+    <w:p>
+      <w:pPr>
+        <w:keepNext/>
+        <w:spacing w:after="120"/>
+      </w:pPr>
+      <w:r>
+        <w:t>查阅附录，不计主讲时长</w:t>
+      </w:r>
+    </w:p>
+    <w:p>
+      <w:r>
+        <w:t>美国经验可以帮助我们思考成熟市场，但必须保持定义。五千头以上经营单位的存栏份额，从二〇〇二年的百分之五十三提高到二〇二二年的百分之七十五。这是按经营单位规模分组，成员会跨组迁移，不能直接当固定企业的所有权集中度。</w:t>
+      </w:r>
+    </w:p>
+    <w:p>
+      <w:r>
+        <w:t>美国商业屠宰头数过去十年复合增速约百分之一点零六，说明行业总量成熟之后，头部仍可能通过份额变化增长。USDA育肥系统调查还显示，大规模组的经济成本点值更低，但单位是美元每一百磅活重增量，包含购入仔猪及合同双方相关成本，与中国每公斤出栏活重成本比较前要调整。</w:t>
+      </w:r>
+    </w:p>
+    <w:p>
+      <w:r>
+        <w:t>Smithfield内部养猪量下降，也提示我们成长可以来自更有效地组织猪源和减少低回报资本占用。对国内养殖行业而言，自养、加工、技术服务和海外合作的扩张，都需要比较投入、资本占用和回收期，不能只看规模。</w:t>
+      </w:r>
+    </w:p>
+    <w:p>
+      <w:pPr>
+        <w:spacing w:after="200"/>
+      </w:pPr>
+      <w:r>
+        <w:rPr>
+          <w:sz w:val="18"/>
+        </w:rPr>
+        <w:t>来源 报告§10.6—§10.8；参考[52]—[58]</w:t>
+        <w:br/>
+        <w:t>数据与假设依据（不朗读） 53/75%为美国规模组存栏份额；商业屠宰CAGR1.06%为2015—2025计算；85.85/61.21美元单位为100磅增重经济成本；Smithfield1760/1110万头为内部养殖量。参考[52]—[58]，不同生产阶段不可直接套中国成本。</w:t>
+      </w:r>
+    </w:p>
+    <w:p>
+      <w:r>
+        <w:rPr>
+          <w:sz w:val="18"/>
+        </w:rPr>
+        <w:t>录制提示：本页预留约7秒供图表阅读或操作。</w:t>
+      </w:r>
+    </w:p>
+    <w:p>
+      <w:pPr>
+        <w:pStyle w:val="Heading1"/>
+      </w:pPr>
+      <w:r>
+        <w:t>第57页 附录H 历史反应系数的敏感性</w:t>
+      </w:r>
+    </w:p>
+    <w:p>
+      <w:pPr>
+        <w:keepNext/>
+        <w:spacing w:after="120"/>
+      </w:pPr>
+      <w:r>
+        <w:t>查阅附录，不计主讲时长</w:t>
+      </w:r>
+    </w:p>
+    <w:p>
+      <w:r>
+        <w:t>历史振幅系数的构造，是用价格谷到峰的对数涨幅，除以历史有效供给收缩的负对数。默认假设历史MSY每年提高百分之二，两段MARA校准系数的中位数约七点五九。</w:t>
+      </w:r>
+    </w:p>
+    <w:p>
+      <w:r>
+        <w:t>一个看起来反直觉的地方是：如果提高历史效率增长假设，算出的振幅系数反而更大。原因是同样的母猪减少，被效率改善抵消后，历史有效供给收缩更小；同样的价格上涨就被归因给更小的数量变化，系数自然上升。</w:t>
+      </w:r>
+    </w:p>
+    <w:p>
+      <w:r>
+        <w:t>当有效供给收缩接近零，分母也接近零，系数会非常不稳定。代码因此对有效去化不足百分之二的阶段排除自动校准。这个阈值是数值稳定规则，不能当经济定律。表中高效率假设得到很高价格，主要反映外推函数的放大效应，其用途更接近压力测试，预测能力仍需要额外的样本外检验。</w:t>
+      </w:r>
+    </w:p>
+    <w:p>
+      <w:pPr>
+        <w:spacing w:after="200"/>
+      </w:pPr>
+      <w:r>
+        <w:rPr>
+          <w:sz w:val="18"/>
+        </w:rPr>
+        <w:t>来源 报告§6.2—§6.3</w:t>
+        <w:br/>
+        <w:t>数据与假设依据（不朗读） 历史MSY年增0/2/5%或仅用某一阶段均为校准选择；β与2027均价/Q4价由独立价格脚本重算。不是已观测的未来价格或效率。</w:t>
+      </w:r>
+    </w:p>
+    <w:p>
+      <w:r>
+        <w:rPr>
+          <w:sz w:val="18"/>
+        </w:rPr>
+        <w:t>录制提示：本页预留约8秒供图表阅读或操作。</w:t>
       </w:r>
     </w:p>
     <w:sectPr>

</xml_diff>